<commit_message>
Sân: adaugă cele 2 propuneri intervenționale lipsă; „sămânță” → „reper”
- Localizarea preoperatorie a leziunilor nepalpabile și drenajul percutan al
  abcesului mamar (ambele Tip I, home decis = Sân) erau propuneri în §15, dar
  lipseau din 09-san.yaml — adăugate în „Propuneri noi”.
- Terminologie: „sămânță radioactivă/magnetică” → „reper radioactiv/magnetic”
  (EDITORIAL-decisions.md).

Co-Authored-By: Claude Sonnet 5 <noreply@anthropic.com>
Claude-Session: https://claude.ai/code/session_01CB1qxeCwYtJ1rmMiMw8agr
</commit_message>
<xml_diff>
--- a/pentru-editori/09-san/09-san.docx
+++ b/pentru-editori/09-san/09-san.docx
@@ -3082,6 +3082,564 @@
     <w:p/>
     <w:p>
       <w:pPr>
+        <w:pStyle w:val="Heading3"/>
+      </w:pPr>
+      <w:r>
+        <w:rPr>
+          <w:color w:val="1C5D8C"/>
+        </w:rPr>
+        <w:t>Paciente cu simptome și semne sugestive de cancer — Localizare preoperatorie ghidată imagistic a leziunilor nepalpabile</w:t>
+      </w:r>
+    </w:p>
+    <w:p>
+      <w:r>
+        <w:rPr>
+          <w:i/>
+        </w:rPr>
+        <w:t>Cf. ACR Practice Parameter – Breast Localization; NCCN. (Intervențional mamar — rămâne în Sân.)</w:t>
+      </w:r>
+    </w:p>
+    <w:tbl>
+      <w:tblPr>
+        <w:tblStyle w:val="LightGrid-Accent1"/>
+        <w:tblW w:type="auto" w:w="0"/>
+        <w:tblLook w:firstColumn="1" w:firstRow="1" w:lastColumn="0" w:lastRow="0" w:noHBand="0" w:noVBand="1" w:val="04A0"/>
+      </w:tblPr>
+      <w:tblGrid>
+        <w:gridCol w:w="1080"/>
+        <w:gridCol w:w="1080"/>
+        <w:gridCol w:w="1080"/>
+        <w:gridCol w:w="1080"/>
+        <w:gridCol w:w="1080"/>
+        <w:gridCol w:w="1080"/>
+        <w:gridCol w:w="1080"/>
+        <w:gridCol w:w="1080"/>
+      </w:tblGrid>
+      <w:tr>
+        <w:tc>
+          <w:tcPr>
+            <w:tcW w:type="dxa" w:w="1080"/>
+          </w:tcPr>
+          <w:p>
+            <w:r/>
+            <w:r>
+              <w:rPr>
+                <w:b/>
+                <w:i w:val="0"/>
+              </w:rPr>
+              <w:t>Tip</w:t>
+            </w:r>
+          </w:p>
+        </w:tc>
+        <w:tc>
+          <w:tcPr>
+            <w:tcW w:type="dxa" w:w="1080"/>
+          </w:tcPr>
+          <w:p>
+            <w:r/>
+            <w:r>
+              <w:rPr>
+                <w:b/>
+                <w:i w:val="0"/>
+              </w:rPr>
+              <w:t>Examen</w:t>
+            </w:r>
+          </w:p>
+        </w:tc>
+        <w:tc>
+          <w:tcPr>
+            <w:tcW w:type="dxa" w:w="1080"/>
+          </w:tcPr>
+          <w:p>
+            <w:r/>
+            <w:r>
+              <w:rPr>
+                <w:b/>
+                <w:i w:val="0"/>
+              </w:rPr>
+              <w:t>Indicație</w:t>
+            </w:r>
+          </w:p>
+        </w:tc>
+        <w:tc>
+          <w:tcPr>
+            <w:tcW w:type="dxa" w:w="1080"/>
+          </w:tcPr>
+          <w:p>
+            <w:r/>
+            <w:r>
+              <w:rPr>
+                <w:b/>
+                <w:i w:val="0"/>
+              </w:rPr>
+              <w:t>Grad</w:t>
+            </w:r>
+          </w:p>
+        </w:tc>
+        <w:tc>
+          <w:tcPr>
+            <w:tcW w:type="dxa" w:w="1080"/>
+          </w:tcPr>
+          <w:p>
+            <w:r/>
+            <w:r>
+              <w:rPr>
+                <w:b/>
+                <w:i w:val="0"/>
+              </w:rPr>
+              <w:t>Doză</w:t>
+            </w:r>
+          </w:p>
+        </w:tc>
+        <w:tc>
+          <w:tcPr>
+            <w:tcW w:type="dxa" w:w="1080"/>
+          </w:tcPr>
+          <w:p>
+            <w:r/>
+            <w:r>
+              <w:rPr>
+                <w:b/>
+                <w:i w:val="0"/>
+              </w:rPr>
+              <w:t>Comentarii</w:t>
+            </w:r>
+          </w:p>
+        </w:tc>
+        <w:tc>
+          <w:tcPr>
+            <w:tcW w:type="dxa" w:w="1080"/>
+          </w:tcPr>
+          <w:p>
+            <w:r/>
+            <w:r>
+              <w:rPr>
+                <w:b/>
+                <w:i w:val="0"/>
+              </w:rPr>
+              <w:t>Decizie</w:t>
+            </w:r>
+          </w:p>
+        </w:tc>
+        <w:tc>
+          <w:tcPr>
+            <w:tcW w:type="dxa" w:w="1080"/>
+          </w:tcPr>
+          <w:p>
+            <w:r/>
+            <w:r>
+              <w:rPr>
+                <w:b/>
+                <w:i w:val="0"/>
+              </w:rPr>
+              <w:t>Comentariu editor</w:t>
+            </w:r>
+          </w:p>
+        </w:tc>
+      </w:tr>
+      <w:tr>
+        <w:tc>
+          <w:tcPr>
+            <w:tcW w:type="dxa" w:w="1080"/>
+          </w:tcPr>
+          <w:p>
+            <w:r/>
+            <w:r>
+              <w:rPr>
+                <w:b w:val="0"/>
+                <w:i w:val="0"/>
+              </w:rPr>
+              <w:t>I</w:t>
+            </w:r>
+          </w:p>
+        </w:tc>
+        <w:tc>
+          <w:tcPr>
+            <w:tcW w:type="dxa" w:w="1080"/>
+          </w:tcPr>
+          <w:p>
+            <w:r/>
+            <w:r>
+              <w:rPr>
+                <w:b w:val="0"/>
+                <w:i w:val="0"/>
+              </w:rPr>
+              <w:t>Localizare preoperatorie ghidată imagistic (harpon / reper radioactiv/magnetic)</w:t>
+            </w:r>
+          </w:p>
+        </w:tc>
+        <w:tc>
+          <w:tcPr>
+            <w:tcW w:type="dxa" w:w="1080"/>
+          </w:tcPr>
+          <w:p>
+            <w:r/>
+            <w:r>
+              <w:rPr>
+                <w:b w:val="0"/>
+                <w:i w:val="0"/>
+              </w:rPr>
+              <w:t>Indicat</w:t>
+            </w:r>
+          </w:p>
+        </w:tc>
+        <w:tc>
+          <w:tcPr>
+            <w:tcW w:type="dxa" w:w="1080"/>
+          </w:tcPr>
+          <w:p>
+            <w:r/>
+            <w:r>
+              <w:rPr>
+                <w:b w:val="0"/>
+                <w:i w:val="0"/>
+              </w:rPr>
+              <w:t>B</w:t>
+            </w:r>
+          </w:p>
+        </w:tc>
+        <w:tc>
+          <w:tcPr>
+            <w:tcW w:type="dxa" w:w="1080"/>
+          </w:tcPr>
+          <w:p>
+            <w:r/>
+            <w:r>
+              <w:rPr>
+                <w:b w:val="0"/>
+                <w:i w:val="0"/>
+              </w:rPr>
+              <w:t>1–2</w:t>
+            </w:r>
+          </w:p>
+        </w:tc>
+        <w:tc>
+          <w:tcPr>
+            <w:tcW w:type="dxa" w:w="1080"/>
+          </w:tcPr>
+          <w:p>
+            <w:r/>
+            <w:r>
+              <w:rPr>
+                <w:b w:val="0"/>
+                <w:i w:val="0"/>
+              </w:rPr>
+              <w:t>Marcarea leziunii nepalpabile înainte de excizia chirurgicală; ghidaj ecografic, stereotaxic sau IRM, după vizibilitatea leziunii. Terapeutic = Nu.</w:t>
+            </w:r>
+          </w:p>
+        </w:tc>
+        <w:tc>
+          <w:tcPr>
+            <w:tcW w:type="dxa" w:w="1080"/>
+          </w:tcPr>
+          <w:p>
+            <w:r/>
+            <w:r>
+              <w:rPr>
+                <w:b w:val="0"/>
+                <w:i w:val="0"/>
+              </w:rPr>
+            </w:r>
+          </w:p>
+        </w:tc>
+        <w:tc>
+          <w:tcPr>
+            <w:tcW w:type="dxa" w:w="1080"/>
+          </w:tcPr>
+          <w:p>
+            <w:r/>
+            <w:r>
+              <w:rPr>
+                <w:b w:val="0"/>
+                <w:i w:val="0"/>
+              </w:rPr>
+            </w:r>
+          </w:p>
+        </w:tc>
+      </w:tr>
+    </w:tbl>
+    <w:p/>
+    <w:p>
+      <w:pPr>
+        <w:pStyle w:val="Heading3"/>
+      </w:pPr>
+      <w:r>
+        <w:rPr>
+          <w:color w:val="1C5D8C"/>
+        </w:rPr>
+        <w:t>Paciente cu simptome și semne nesugestive de cancer — Inflamație mamară – drenaj de abces</w:t>
+      </w:r>
+    </w:p>
+    <w:p>
+      <w:r>
+        <w:rPr>
+          <w:i/>
+        </w:rPr>
+        <w:t>Management standard al abcesului mamar (drenaj ghidat percutan). (Intervențional mamar — rămâne în Sân.)</w:t>
+      </w:r>
+    </w:p>
+    <w:tbl>
+      <w:tblPr>
+        <w:tblStyle w:val="LightGrid-Accent1"/>
+        <w:tblW w:type="auto" w:w="0"/>
+        <w:tblLook w:firstColumn="1" w:firstRow="1" w:lastColumn="0" w:lastRow="0" w:noHBand="0" w:noVBand="1" w:val="04A0"/>
+      </w:tblPr>
+      <w:tblGrid>
+        <w:gridCol w:w="1080"/>
+        <w:gridCol w:w="1080"/>
+        <w:gridCol w:w="1080"/>
+        <w:gridCol w:w="1080"/>
+        <w:gridCol w:w="1080"/>
+        <w:gridCol w:w="1080"/>
+        <w:gridCol w:w="1080"/>
+        <w:gridCol w:w="1080"/>
+      </w:tblGrid>
+      <w:tr>
+        <w:tc>
+          <w:tcPr>
+            <w:tcW w:type="dxa" w:w="1080"/>
+          </w:tcPr>
+          <w:p>
+            <w:r/>
+            <w:r>
+              <w:rPr>
+                <w:b/>
+                <w:i w:val="0"/>
+              </w:rPr>
+              <w:t>Tip</w:t>
+            </w:r>
+          </w:p>
+        </w:tc>
+        <w:tc>
+          <w:tcPr>
+            <w:tcW w:type="dxa" w:w="1080"/>
+          </w:tcPr>
+          <w:p>
+            <w:r/>
+            <w:r>
+              <w:rPr>
+                <w:b/>
+                <w:i w:val="0"/>
+              </w:rPr>
+              <w:t>Examen</w:t>
+            </w:r>
+          </w:p>
+        </w:tc>
+        <w:tc>
+          <w:tcPr>
+            <w:tcW w:type="dxa" w:w="1080"/>
+          </w:tcPr>
+          <w:p>
+            <w:r/>
+            <w:r>
+              <w:rPr>
+                <w:b/>
+                <w:i w:val="0"/>
+              </w:rPr>
+              <w:t>Indicație</w:t>
+            </w:r>
+          </w:p>
+        </w:tc>
+        <w:tc>
+          <w:tcPr>
+            <w:tcW w:type="dxa" w:w="1080"/>
+          </w:tcPr>
+          <w:p>
+            <w:r/>
+            <w:r>
+              <w:rPr>
+                <w:b/>
+                <w:i w:val="0"/>
+              </w:rPr>
+              <w:t>Grad</w:t>
+            </w:r>
+          </w:p>
+        </w:tc>
+        <w:tc>
+          <w:tcPr>
+            <w:tcW w:type="dxa" w:w="1080"/>
+          </w:tcPr>
+          <w:p>
+            <w:r/>
+            <w:r>
+              <w:rPr>
+                <w:b/>
+                <w:i w:val="0"/>
+              </w:rPr>
+              <w:t>Doză</w:t>
+            </w:r>
+          </w:p>
+        </w:tc>
+        <w:tc>
+          <w:tcPr>
+            <w:tcW w:type="dxa" w:w="1080"/>
+          </w:tcPr>
+          <w:p>
+            <w:r/>
+            <w:r>
+              <w:rPr>
+                <w:b/>
+                <w:i w:val="0"/>
+              </w:rPr>
+              <w:t>Comentarii</w:t>
+            </w:r>
+          </w:p>
+        </w:tc>
+        <w:tc>
+          <w:tcPr>
+            <w:tcW w:type="dxa" w:w="1080"/>
+          </w:tcPr>
+          <w:p>
+            <w:r/>
+            <w:r>
+              <w:rPr>
+                <w:b/>
+                <w:i w:val="0"/>
+              </w:rPr>
+              <w:t>Decizie</w:t>
+            </w:r>
+          </w:p>
+        </w:tc>
+        <w:tc>
+          <w:tcPr>
+            <w:tcW w:type="dxa" w:w="1080"/>
+          </w:tcPr>
+          <w:p>
+            <w:r/>
+            <w:r>
+              <w:rPr>
+                <w:b/>
+                <w:i w:val="0"/>
+              </w:rPr>
+              <w:t>Comentariu editor</w:t>
+            </w:r>
+          </w:p>
+        </w:tc>
+      </w:tr>
+      <w:tr>
+        <w:tc>
+          <w:tcPr>
+            <w:tcW w:type="dxa" w:w="1080"/>
+          </w:tcPr>
+          <w:p>
+            <w:r/>
+            <w:r>
+              <w:rPr>
+                <w:b w:val="0"/>
+                <w:i w:val="0"/>
+              </w:rPr>
+              <w:t>I</w:t>
+            </w:r>
+          </w:p>
+        </w:tc>
+        <w:tc>
+          <w:tcPr>
+            <w:tcW w:type="dxa" w:w="1080"/>
+          </w:tcPr>
+          <w:p>
+            <w:r/>
+            <w:r>
+              <w:rPr>
+                <w:b w:val="0"/>
+                <w:i w:val="0"/>
+              </w:rPr>
+              <w:t>Drenaj percutan ghidat ecografic</w:t>
+            </w:r>
+          </w:p>
+        </w:tc>
+        <w:tc>
+          <w:tcPr>
+            <w:tcW w:type="dxa" w:w="1080"/>
+          </w:tcPr>
+          <w:p>
+            <w:r/>
+            <w:r>
+              <w:rPr>
+                <w:b w:val="0"/>
+                <w:i w:val="0"/>
+              </w:rPr>
+              <w:t>Indicat</w:t>
+            </w:r>
+          </w:p>
+        </w:tc>
+        <w:tc>
+          <w:tcPr>
+            <w:tcW w:type="dxa" w:w="1080"/>
+          </w:tcPr>
+          <w:p>
+            <w:r/>
+            <w:r>
+              <w:rPr>
+                <w:b w:val="0"/>
+                <w:i w:val="0"/>
+              </w:rPr>
+              <w:t>B</w:t>
+            </w:r>
+          </w:p>
+        </w:tc>
+        <w:tc>
+          <w:tcPr>
+            <w:tcW w:type="dxa" w:w="1080"/>
+          </w:tcPr>
+          <w:p>
+            <w:r/>
+            <w:r>
+              <w:rPr>
+                <w:b w:val="0"/>
+                <w:i w:val="0"/>
+              </w:rPr>
+              <w:t>0</w:t>
+            </w:r>
+          </w:p>
+        </w:tc>
+        <w:tc>
+          <w:tcPr>
+            <w:tcW w:type="dxa" w:w="1080"/>
+          </w:tcPr>
+          <w:p>
+            <w:r/>
+            <w:r>
+              <w:rPr>
+                <w:b w:val="0"/>
+                <w:i w:val="0"/>
+              </w:rPr>
+              <w:t>Evacuarea abcesului mamar ghidată ecografic (aspirație cu ac / cateter), ± lavaj; alternativă la incizia chirurgicală. Terapeutic = Da.</w:t>
+            </w:r>
+          </w:p>
+        </w:tc>
+        <w:tc>
+          <w:tcPr>
+            <w:tcW w:type="dxa" w:w="1080"/>
+          </w:tcPr>
+          <w:p>
+            <w:r/>
+            <w:r>
+              <w:rPr>
+                <w:b w:val="0"/>
+                <w:i w:val="0"/>
+              </w:rPr>
+            </w:r>
+          </w:p>
+        </w:tc>
+        <w:tc>
+          <w:tcPr>
+            <w:tcW w:type="dxa" w:w="1080"/>
+          </w:tcPr>
+          <w:p>
+            <w:r/>
+            <w:r>
+              <w:rPr>
+                <w:b w:val="0"/>
+                <w:i w:val="0"/>
+              </w:rPr>
+            </w:r>
+          </w:p>
+        </w:tc>
+      </w:tr>
+    </w:tbl>
+    <w:p/>
+    <w:p>
+      <w:pPr>
         <w:pStyle w:val="Heading2"/>
       </w:pPr>
       <w:r>

</xml_diff>